<commit_message>
Polish Mantee prototype for public review
</commit_message>
<xml_diff>
--- a/prototype/assets/documents/forms/building-permit-application.docx
+++ b/prototype/assets/documents/forms/building-permit-application.docx
@@ -23,14 +23,14 @@
     <w:sdt>
       <w:sdtPr>
         <w:lock w:val="contentLocked"/>
-        <w:id w:val="-880631050"/>
+        <w:id w:val="-1762194033"/>
         <w:tag w:val="goog_rdk_0"/>
       </w:sdtPr>
       <w:sdtContent>
         <w:tbl>
           <w:tblPr>
             <w:tblStyle w:val="Table1"/>
-            <w:tblpPr w:leftFromText="180" w:rightFromText="180" w:topFromText="0" w:bottomFromText="180" w:vertAnchor="margin" w:horzAnchor="margin" w:tblpX="7488.000000000001" w:tblpY="-364.8378906250002"/>
+            <w:tblpPr w:leftFromText="180" w:rightFromText="180" w:topFromText="0" w:bottomFromText="180" w:vertAnchor="margin" w:horzAnchor="margin" w:tblpX="7488.000000000001" w:tblpY="0"/>
             <w:tblW w:w="3225.0" w:type="dxa"/>
             <w:jc w:val="right"/>
             <w:tblInd w:w="8505.0" w:type="dxa"/>
@@ -187,7 +187,7 @@
           <w:rFonts w:ascii="Arial Narrow" w:cs="Arial Narrow" w:eastAsia="Arial Narrow" w:hAnsi="Arial Narrow"/>
           <w:rtl w:val="0"/>
         </w:rPr>
-        <w:t xml:space="preserve">PO Box 2348, Mantee, MS 39744</w:t>
+        <w:t xml:space="preserve">PO Box 2348, Mantee, MS 39751</w:t>
         <w:tab/>
         <w:t xml:space="preserve">townofmantee@gmail.com</w:t>
       </w:r>
@@ -258,18 +258,9 @@
           <w:rFonts w:ascii="Arial Narrow" w:cs="Arial Narrow" w:eastAsia="Arial Narrow" w:hAnsi="Arial Narrow"/>
         </w:rPr>
       </w:pPr>
-      <w:r>
-        <w:rPr>
-          <w:rFonts w:ascii="Arial Narrow" w:cs="Arial Narrow" w:eastAsia="Arial Narrow" w:hAnsi="Arial Narrow"/>
-          <w:b w:val="1"/>
-          <w:bCs w:val="1"/>
-          <w:rtl w:val="0"/>
-        </w:rPr>
-        <w:t xml:space="preserve">Applicant </w:t>
-      </w:r>
       <w:sdt>
         <w:sdtPr>
-          <w:id w:val="470967967"/>
+          <w:id w:val="683989311"/>
           <w:tag w:val="goog_rdk_1"/>
         </w:sdtPr>
         <w:sdtContent>
@@ -280,7 +271,7 @@
               <w:bCs w:val="1"/>
               <w:rtl w:val="0"/>
             </w:rPr>
-            <w:t xml:space="preserve">Name:_______________________________________ As:    ⃞   </w:t>
+            <w:t xml:space="preserve">Applicant Name:_______________________________________ As:    ⃞   </w:t>
           </w:r>
         </w:sdtContent>
       </w:sdt>
@@ -293,7 +284,7 @@
       </w:r>
       <w:sdt>
         <w:sdtPr>
-          <w:id w:val="1444464528"/>
+          <w:id w:val="-2029109655"/>
           <w:tag w:val="goog_rdk_2"/>
         </w:sdtPr>
         <w:sdtContent>
@@ -317,7 +308,7 @@
       </w:r>
       <w:sdt>
         <w:sdtPr>
-          <w:id w:val="1112216965"/>
+          <w:id w:val="-2018909022"/>
           <w:tag w:val="goog_rdk_3"/>
         </w:sdtPr>
         <w:sdtContent>
@@ -493,7 +484,7 @@
       </w:pPr>
       <w:sdt>
         <w:sdtPr>
-          <w:id w:val="1017740991"/>
+          <w:id w:val="-124102485"/>
           <w:tag w:val="goog_rdk_4"/>
         </w:sdtPr>
         <w:sdtContent>
@@ -517,7 +508,7 @@
       </w:r>
       <w:sdt>
         <w:sdtPr>
-          <w:id w:val="1781206960"/>
+          <w:id w:val="-1034547581"/>
           <w:tag w:val="goog_rdk_5"/>
         </w:sdtPr>
         <w:sdtContent>
@@ -676,7 +667,7 @@
       </w:pPr>
       <w:sdt>
         <w:sdtPr>
-          <w:id w:val="-1369595894"/>
+          <w:id w:val="-890589776"/>
           <w:tag w:val="goog_rdk_6"/>
         </w:sdtPr>
         <w:sdtContent>
@@ -729,7 +720,7 @@
       </w:r>
       <w:sdt>
         <w:sdtPr>
-          <w:id w:val="-1764775196"/>
+          <w:id w:val="1825979509"/>
           <w:tag w:val="goog_rdk_7"/>
         </w:sdtPr>
         <w:sdtContent>
@@ -797,7 +788,7 @@
     <w:sdt>
       <w:sdtPr>
         <w:lock w:val="contentLocked"/>
-        <w:id w:val="625056041"/>
+        <w:id w:val="700273661"/>
         <w:tag w:val="goog_rdk_10"/>
       </w:sdtPr>
       <w:sdtContent>
@@ -845,7 +836,6 @@
                 <w:pPr>
                   <w:keepNext w:val="0"/>
                   <w:keepLines w:val="0"/>
-                  <w:pageBreakBefore w:val="0"/>
                   <w:widowControl w:val="0"/>
                   <w:pBdr>
                     <w:top w:space="0" w:sz="0" w:val="nil"/>
@@ -882,7 +872,6 @@
                 <w:pPr>
                   <w:keepNext w:val="0"/>
                   <w:keepLines w:val="0"/>
-                  <w:pageBreakBefore w:val="0"/>
                   <w:widowControl w:val="0"/>
                   <w:pBdr>
                     <w:top w:space="0" w:sz="0" w:val="nil"/>
@@ -901,7 +890,7 @@
                 </w:pPr>
                 <w:sdt>
                   <w:sdtPr>
-                    <w:id w:val="1269350914"/>
+                    <w:id w:val="-500757280"/>
                     <w:tag w:val="goog_rdk_8"/>
                   </w:sdtPr>
                   <w:sdtContent>
@@ -925,7 +914,7 @@
                 </w:r>
                 <w:sdt>
                   <w:sdtPr>
-                    <w:id w:val="-66166403"/>
+                    <w:id w:val="988423833"/>
                     <w:tag w:val="goog_rdk_9"/>
                   </w:sdtPr>
                   <w:sdtContent>
@@ -952,7 +941,6 @@
                 <w:pPr>
                   <w:keepNext w:val="0"/>
                   <w:keepLines w:val="0"/>
-                  <w:pageBreakBefore w:val="0"/>
                   <w:widowControl w:val="0"/>
                   <w:pBdr>
                     <w:top w:space="0" w:sz="0" w:val="nil"/>
@@ -1190,77 +1178,6 @@
       <w:szCs w:val="52"/>
     </w:rPr>
   </w:style>
-  <w:style w:type="paragraph" w:styleId="Normal" w:default="1">
-    <w:name w:val="normal"/>
-  </w:style>
-  <w:style w:type="table" w:styleId="TableNormal" w:default="1">
-    <w:name w:val="Table Normal"/>
-  </w:style>
-  <w:style w:type="character" w:styleId="DefaultParagraphFont" w:default="1">
-    <w:name w:val="Default Paragraph Font"/>
-    <w:uiPriority w:val="1"/>
-    <w:semiHidden w:val="1"/>
-    <w:unhideWhenUsed w:val="1"/>
-  </w:style>
-  <w:style w:type="table" w:styleId="TableNormal" w:default="1">
-    <w:name w:val="Normal Table"/>
-    <w:uiPriority w:val="99"/>
-    <w:semiHidden w:val="1"/>
-    <w:unhideWhenUsed w:val="1"/>
-    <w:qFormat w:val="1"/>
-    <w:tblPr>
-      <w:tblInd w:w="0.0" w:type="dxa"/>
-      <w:tblCellMar>
-        <w:top w:w="0.0" w:type="dxa"/>
-        <w:left w:w="108.0" w:type="dxa"/>
-        <w:bottom w:w="0.0" w:type="dxa"/>
-        <w:right w:w="108.0" w:type="dxa"/>
-      </w:tblCellMar>
-    </w:tblPr>
-  </w:style>
-  <w:style w:type="numbering" w:styleId="NoList" w:default="1">
-    <w:name w:val="No List"/>
-    <w:uiPriority w:val="99"/>
-    <w:semiHidden w:val="1"/>
-    <w:unhideWhenUsed w:val="1"/>
-  </w:style>
-  <w:style w:type="character" w:styleId="TitleChar" w:customStyle="1">
-    <w:name w:val="Title Char"/>
-    <w:basedOn w:val="DefaultParagraphFont"/>
-    <w:link w:val="Title"/>
-    <w:uiPriority w:val="10"/>
-    <w:rsid w:val="00E17791"/>
-    <w:rPr>
-      <w:rFonts w:asciiTheme="majorHAnsi" w:cstheme="majorBidi" w:eastAsiaTheme="majorEastAsia" w:hAnsiTheme="majorHAnsi"/>
-      <w:color w:val="17365d" w:themeColor="text2" w:themeShade="0000BF"/>
-      <w:spacing w:val="5"/>
-      <w:kern w:val="28"/>
-      <w:sz w:val="52"/>
-      <w:szCs w:val="52"/>
-    </w:rPr>
-  </w:style>
-  <w:style w:type="character" w:styleId="Hyperlink">
-    <w:name w:val="Hyperlink"/>
-    <w:basedOn w:val="DefaultParagraphFont"/>
-    <w:uiPriority w:val="99"/>
-    <w:unhideWhenUsed w:val="1"/>
-    <w:rsid w:val="0022673E"/>
-    <w:rPr>
-      <w:color w:val="0000ff" w:themeColor="hyperlink"/>
-      <w:u w:val="single"/>
-    </w:rPr>
-  </w:style>
-  <w:style w:type="paragraph" w:styleId="ListParagraph">
-    <w:name w:val="List Paragraph"/>
-    <w:basedOn w:val="Normal"/>
-    <w:uiPriority w:val="34"/>
-    <w:qFormat w:val="1"/>
-    <w:rsid w:val="00932BE8"/>
-    <w:pPr>
-      <w:ind w:left="720"/>
-      <w:contextualSpacing w:val="1"/>
-    </w:pPr>
-  </w:style>
   <w:style w:type="paragraph" w:styleId="Subtitle">
     <w:name w:val="Subtitle"/>
     <w:basedOn w:val="Normal"/>
@@ -1285,6 +1202,12 @@
     <w:tblPr>
       <w:tblStyleRowBandSize w:val="1"/>
       <w:tblStyleColBandSize w:val="1"/>
+      <w:tblCellMar>
+        <w:top w:w="0.0" w:type="dxa"/>
+        <w:left w:w="108.0" w:type="dxa"/>
+        <w:bottom w:w="0.0" w:type="dxa"/>
+        <w:right w:w="108.0" w:type="dxa"/>
+      </w:tblCellMar>
     </w:tblPr>
   </w:style>
   <w:style w:type="table" w:styleId="Table2">
@@ -1292,6 +1215,12 @@
     <w:tblPr>
       <w:tblStyleRowBandSize w:val="1"/>
       <w:tblStyleColBandSize w:val="1"/>
+      <w:tblCellMar>
+        <w:top w:w="0.0" w:type="dxa"/>
+        <w:left w:w="108.0" w:type="dxa"/>
+        <w:bottom w:w="0.0" w:type="dxa"/>
+        <w:right w:w="108.0" w:type="dxa"/>
+      </w:tblCellMar>
     </w:tblPr>
   </w:style>
 </w:styles>
@@ -1340,7 +1269,7 @@
     </a:clrScheme>
     <a:fontScheme name="Office">
       <a:majorFont>
-        <a:latin typeface="Cambria"/>
+        <a:latin typeface="Calibri"/>
         <a:ea typeface=""/>
         <a:cs typeface=""/>
         <a:font script="Jpan" typeface="ＭＳ ゴシック"/>
@@ -1372,9 +1301,10 @@
         <a:font script="Mong" typeface="Mongolian Baiti"/>
         <a:font script="Viet" typeface="Times New Roman"/>
         <a:font script="Uigh" typeface="Microsoft Uighur"/>
+        <a:font script="Geor" typeface="Sylfaen"/>
       </a:majorFont>
       <a:minorFont>
-        <a:latin typeface="Calibri"/>
+        <a:latin typeface="Cambria"/>
         <a:ea typeface=""/>
         <a:cs typeface=""/>
         <a:font script="Jpan" typeface="ＭＳ 明朝"/>
@@ -1406,6 +1336,7 @@
         <a:font script="Mong" typeface="Mongolian Baiti"/>
         <a:font script="Viet" typeface="Arial"/>
         <a:font script="Uigh" typeface="Microsoft Uighur"/>
+        <a:font script="Geor" typeface="Sylfaen"/>
       </a:minorFont>
     </a:fontScheme>
     <a:fmtScheme name="Office">
@@ -1440,20 +1371,16 @@
           <a:gsLst>
             <a:gs pos="0">
               <a:schemeClr val="phClr">
-                <a:shade val="51000"/>
-                <a:satMod val="130000"/>
-              </a:schemeClr>
-            </a:gs>
-            <a:gs pos="80000">
-              <a:schemeClr val="phClr">
-                <a:shade val="93000"/>
+                <a:tint val="100000"/>
+                <a:shade val="100000"/>
                 <a:satMod val="130000"/>
               </a:schemeClr>
             </a:gs>
             <a:gs pos="100000">
               <a:schemeClr val="phClr">
-                <a:shade val="94000"/>
-                <a:satMod val="135000"/>
+                <a:tint val="50000"/>
+                <a:shade val="100000"/>
+                <a:satMod val="350000"/>
               </a:schemeClr>
             </a:gs>
           </a:gsLst>
@@ -1575,14 +1502,53 @@
       </a:bgFillStyleLst>
     </a:fmtScheme>
   </a:themeElements>
-  <a:objectDefaults/>
+  <a:objectDefaults>
+    <a:spDef>
+      <a:spPr/>
+      <a:bodyPr/>
+      <a:lstStyle/>
+      <a:style>
+        <a:lnRef idx="1">
+          <a:schemeClr val="accent1"/>
+        </a:lnRef>
+        <a:fillRef idx="3">
+          <a:schemeClr val="accent1"/>
+        </a:fillRef>
+        <a:effectRef idx="2">
+          <a:schemeClr val="accent1"/>
+        </a:effectRef>
+        <a:fontRef idx="minor">
+          <a:schemeClr val="lt1"/>
+        </a:fontRef>
+      </a:style>
+    </a:spDef>
+    <a:lnDef>
+      <a:spPr/>
+      <a:bodyPr/>
+      <a:lstStyle/>
+      <a:style>
+        <a:lnRef idx="2">
+          <a:schemeClr val="accent1"/>
+        </a:lnRef>
+        <a:fillRef idx="0">
+          <a:schemeClr val="accent1"/>
+        </a:fillRef>
+        <a:effectRef idx="1">
+          <a:schemeClr val="accent1"/>
+        </a:effectRef>
+        <a:fontRef idx="minor">
+          <a:schemeClr val="tx1"/>
+        </a:fontRef>
+      </a:style>
+    </a:lnDef>
+  </a:objectDefaults>
   <a:extraClrSchemeLst/>
 </a:theme>
 </file>
 
 <file path=customXML/item1.xml><?xml version="1.0" encoding="utf-8"?>
 <go:gDocsCustomXmlDataStorage xmlns:go="http://customooxmlschemas.google.com/" xmlns:r="http://schemas.openxmlformats.org/officeDocument/2006/relationships" uri="GoogleDocsCustomDataVersion2">
-  <go:docsCustomData xmlns:go="http://customooxmlschemas.google.com/" roundtripDataSignature="AMtx7mij/ZwaebMhxvQrmcYLHfVHOnjZcg==">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</go:docsCustomData>
+  <go:docsCustomData xmlns:go="http://customooxmlschemas.google.com/" roundtripDataSignature="AMtx7mgikqp35XeLQaA77Izgt7vRRLC4FA==">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</go:docsCustomData>
 </go:gDocsCustomXmlDataStorage>
 </file>
 

</xml_diff>